<commit_message>
Add India-Austria Bilateral Scheme research proposal (Affenzeller-Yadav collaboration)
</commit_message>
<xml_diff>
--- a/Research_Proposal.docx
+++ b/Research_Proposal.docx
@@ -11,334 +11,1421 @@
         <w:rPr>
           <w:sz w:val="32"/>
         </w:rPr>
-        <w:t>Quantum-Evolutionary Synergies: A Mobility Initiative for Collaborative Research in Quantum Computation and Evolutionary Algorithms</w:t>
+        <w:t>Quantum-Enhanced Evolutionary Computation:</w:t>
+        <w:br/>
+        <w:t>A Bilateral Research Initiative between India and Austria</w:t>
+      </w:r>
+    </w:p>
+    <w:p>
+      <w:pPr>
+        <w:jc w:val="center"/>
+      </w:pPr>
+      <w:r>
+        <w:rPr>
+          <w:b/>
+        </w:rPr>
+        <w:t>India-Austria Bilateral Scientific and Technological Cooperation Programme</w:t>
       </w:r>
     </w:p>
     <w:p/>
     <w:p>
       <w:pPr>
-        <w:pStyle w:val="Heading1"/>
+        <w:pStyle w:val="Heading2"/>
       </w:pPr>
       <w:r>
-        <w:t>1. Background and Motivation</w:t>
-      </w:r>
-    </w:p>
-    <w:p>
-      <w:pPr>
-        <w:pStyle w:val="Heading2"/>
-      </w:pPr>
-      <w:r>
-        <w:t>1.1 Quantum Computation</w:t>
+        <w:t>Principal Investigators</w:t>
       </w:r>
     </w:p>
     <w:p>
       <w:r>
-        <w:t>Quantum computation leverages the principles of quantum mechanics—superposition, entanglement, and interference—to process information in fundamentally new ways. Quantum computers hold the promise of solving certain classes of problems exponentially faster than classical counterparts, including combinatorial optimization, cryptography, simulation of quantum systems, and machine learning tasks. With recent advances in quantum hardware from both academic and industrial laboratories, the field is rapidly transitioning from theoretical exploration to practical implementation on noisy intermediate-scale quantum (NISQ) devices.</w:t>
+        <w:rPr>
+          <w:b/>
+        </w:rPr>
+        <w:t>Austrian Side:</w:t>
+        <w:br/>
       </w:r>
-    </w:p>
-    <w:p>
-      <w:pPr>
-        <w:pStyle w:val="Heading2"/>
-      </w:pPr>
       <w:r>
-        <w:t>1.2 Evolutionary Algorithms</w:t>
+        <w:t>Prof. Dr. Michael Affenzeller</w:t>
+        <w:br/>
+        <w:t>Head, Heuristic and Evolutionary Algorithms Laboratory (HEAL)</w:t>
+        <w:br/>
+        <w:t>Upper Austria University of Applied Sciences, Campus Hagenberg</w:t>
+        <w:br/>
+        <w:t>Softwarepark 11, A-4232 Hagenberg, Austria</w:t>
+        <w:br/>
+        <w:t>Email: michael.affenzeller@heuristiclab.com</w:t>
       </w:r>
     </w:p>
     <w:p>
       <w:r>
-        <w:t>Evolutionary Algorithms (EAs) are a family of population-based metaheuristic optimization techniques inspired by biological evolution. These include Genetic Algorithms, Evolutionary Strategies, Genetic Programming, and Differential Evolution, among others. EAs are widely used to solve complex optimization and search problems where traditional gradient-based methods fail, particularly in high-dimensional, multimodal, and dynamic landscapes. Their inherent parallelism and adaptability make them versatile tools for a broad range of scientific and engineering applications.</w:t>
+        <w:rPr>
+          <w:b/>
+        </w:rPr>
+        <w:t>Indian Side:</w:t>
+        <w:br/>
       </w:r>
-    </w:p>
-    <w:p>
-      <w:pPr>
-        <w:pStyle w:val="Heading2"/>
-      </w:pPr>
       <w:r>
-        <w:t>1.3 Interdisciplinary Opportunity</w:t>
+        <w:t>Dr. Anupam Yadav</w:t>
+        <w:br/>
+        <w:t>Associate Professor, Department of Mathematics and Computing</w:t>
+        <w:br/>
+        <w:t>Dr. B R Ambedkar National Institute of Technology (NIT) Jalandhar</w:t>
+        <w:br/>
+        <w:t>G.T. Road, Amritsar Bypass, Jalandhar, Punjab 144008, India</w:t>
+        <w:br/>
+        <w:t>Email: yadava@nitj.ac.in</w:t>
       </w:r>
     </w:p>
     <w:p>
       <w:r>
-        <w:t>The intersection of Quantum Computation and Evolutionary Algorithms presents a compelling frontier for interdisciplinary research. Two primary directions of synergy exist:</w:t>
+        <w:br w:type="page"/>
       </w:r>
     </w:p>
     <w:p>
       <w:pPr>
-        <w:pStyle w:val="ListBullet"/>
+        <w:pStyle w:val="Heading1"/>
       </w:pPr>
       <w:r>
-        <w:t>Quantum-Inspired Evolutionary Algorithms (QIEAs): Classical evolutionary algorithms enhanced with quantum-mechanical concepts such as superposition and quantum gates to improve exploration and convergence properties.</w:t>
-      </w:r>
-    </w:p>
-    <w:p>
-      <w:pPr>
-        <w:pStyle w:val="ListBullet"/>
-      </w:pPr>
-      <w:r>
-        <w:t>Evolutionary Methods for Quantum Computing: The application of evolutionary techniques to address key challenges in quantum computing, including quantum circuit design and optimization, variational parameter tuning, quantum error correction code discovery, and quantum architecture search.</w:t>
+        <w:t>1. Abstract</w:t>
       </w:r>
     </w:p>
     <w:p>
       <w:r>
-        <w:t>Recent literature demonstrates growing interest in these hybrid approaches. Quantum-inspired algorithms have shown improved performance on benchmark optimization problems, while evolutionary methods have been successfully applied to optimize parameterized quantum circuits in variational quantum eigensolvers (VQE) and quantum approximate optimization algorithms (QAOA). The convergence of these two fields offers substantial potential for advancing both domains through collaborative investigation.</w:t>
-      </w:r>
-    </w:p>
-    <w:p>
-      <w:pPr>
-        <w:pStyle w:val="Heading2"/>
-      </w:pPr>
-      <w:r>
-        <w:t>1.4 Rationale for Collaboration</w:t>
+        <w:t>The convergence of quantum computing and evolutionary algorithms represents one of the most promising frontiers in computational intelligence. This bilateral research initiative between the Heuristic and Evolutionary Algorithms Laboratory (HEAL) at the Upper Austria University of Applied Sciences, Hagenberg, Austria, and the Department of Mathematics and Computing at Dr. B R Ambedkar National Institute of Technology (NIT) Jalandhar, India, aims to establish a sustained collaborative research partnership exploring the synergies between quantum computation and evolutionary optimization methods under the India-Austria Bilateral Scientific and Technological Cooperation Programme.</w:t>
       </w:r>
     </w:p>
     <w:p>
       <w:r>
-        <w:t>Establishing a formal partnership between research groups specializing in Quantum Computation and Evolutionary Algorithms enables the exchange of complementary expertise that neither group possesses independently. This mobility initiative will facilitate the transfer of theoretical knowledge, computational tools, and methodological approaches between the two communities, thereby laying the foundation for sustained, high-impact collaborative research.</w:t>
-      </w:r>
-    </w:p>
-    <w:p>
-      <w:pPr>
-        <w:pStyle w:val="Heading1"/>
-      </w:pPr>
-      <w:r>
-        <w:t>2. Objectives</w:t>
+        <w:t>Quantum computing has emerged as a transformative paradigm in computational science, exploiting quantum mechanical phenomena such as superposition, entanglement, and quantum interference to perform computations that are intractable for classical computers. The development of noisy intermediate-scale quantum (NISQ) devices has opened practical avenues for quantum-enhanced optimization, quantum machine learning, and hybrid quantum-classical algorithms. Simultaneously, evolutionary algorithms have established themselves as powerful metaheuristic optimization methods capable of addressing complex, high-dimensional, multimodal optimization landscapes where traditional mathematical programming approaches fail. The intersection of these two domains—quantum-inspired evolutionary algorithms (QIEAs) and evolutionary methods for quantum computing—offers unprecedented opportunities for algorithmic innovation with far-reaching applications in science and industry.</w:t>
       </w:r>
     </w:p>
     <w:p>
       <w:r>
-        <w:t>The primary objectives of this mobility initiative are:</w:t>
+        <w:t>The Austrian research group led by Prof. Affenzeller at HEAL brings world-class expertise in heuristic and evolutionary algorithms, genetic programming, symbolic regression, and their applications in production optimization, logistics, and bioinformatics. HEAL has developed HeuristicLab, an internationally recognized open-source optimization environment that provides a comprehensive framework for metaheuristic algorithm design, implementation, and empirical evaluation. The Indian research group led by Dr. Yadav at NIT Jalandhar contributes strong expertise in evolutionary computation, swarm intelligence, soft computing, and the development of novel bio-inspired optimization algorithms, including the Artificial Electric Field Algorithm (AEFA) and neural network-based optimization frameworks. Together, these complementary capabilities create an ideal foundation for exploring quantum-evolutionary synergies.</w:t>
       </w:r>
     </w:p>
     <w:p>
       <w:r>
-        <w:t>1. Establish a Collaborative Framework: Create a structured partnership between the two research groups, including formal agreements on knowledge sharing, joint supervision of students, and coordinated research planning.</w:t>
+        <w:t>This project proposes to investigate three interconnected research themes. First, the development of quantum-inspired evolutionary algorithms that incorporate quantum computing principles—such as quantum-bit representation, quantum gate operations, superposition-based population diversity mechanisms, and entanglement-inspired correlation structures—into classical evolutionary optimization frameworks to enhance search efficiency, solution diversity, and convergence properties. Second, the application of evolutionary computation techniques to quantum computing challenges, including the optimization of parameterized quantum circuits for variational quantum algorithms, the automated design of quantum circuits for specific computational tasks, and the evolutionary discovery of quantum error correction codes. Third, the exploration of hybrid quantum-classical evolutionary frameworks that leverage NISQ devices as co-processors within evolutionary optimization loops, enabling quantum-enhanced fitness evaluation, quantum-assisted selection operators, and quantum-accelerated genetic operations.</w:t>
       </w:r>
     </w:p>
     <w:p>
       <w:r>
-        <w:t>2. Exchange Knowledge and Expertise: Facilitate bidirectional knowledge transfer on quantum optimization methods (variational algorithms, quantum annealing, gate-based optimization) and evolutionary computation techniques (multi-objective optimization, adaptive operator selection, fitness landscape analysis).</w:t>
+        <w:t>The collaborative methodology integrates theoretical analysis, algorithm design, implementation in shared software platforms (extending HeuristicLab with quantum-inspired modules and quantum simulation interfaces), and empirical evaluation on benchmark optimization problems as well as real-world application scenarios drawn from both groups' domains of expertise. The project emphasizes researcher mobility as its core mechanism, with planned exchanges of senior researchers, postdoctoral fellows, and doctoral students between Hagenberg and Jalandhar to facilitate deep knowledge transfer, joint algorithm development, and collaborative experimentation.</w:t>
       </w:r>
     </w:p>
     <w:p>
       <w:r>
-        <w:t>3. Investigate Feasibility of Quantum-Inspired Evolutionary Algorithms: Conduct preliminary studies to assess the potential of integrating quantum-mechanical principles into evolutionary optimization frameworks, identifying promising algorithmic variants and benchmark problems.</w:t>
+        <w:t>Expected outcomes include the establishment of a sustainable international research partnership, joint publications in high-impact journals and conferences, development of open-source software modules for quantum-inspired evolutionary optimization, identification of promising research directions for larger collaborative projects, training of early-career researchers in interdisciplinary quantum-evolutionary methods, and the preparation of follow-up grant applications to national and European funding agencies. The project will also contribute to capacity building in both countries by creating shared educational resources, joint training workshops, and cross-institutional student supervision arrangements.</w:t>
       </w:r>
     </w:p>
     <w:p>
       <w:r>
-        <w:t>4. Explore Evolutionary Methods for Quantum Circuit Optimization: Evaluate the applicability of evolutionary strategies for quantum circuit design, parameter optimization in variational quantum algorithms, and quantum machine learning model architecture search.</w:t>
+        <w:t>The proposed collaboration directly addresses strategic priorities identified in both India's and Austria's national science and technology policies, which emphasize international cooperation, quantum technology development, and artificial intelligence innovation. By combining Austria's established expertise in evolutionary algorithm engineering with India's growing capabilities in computational intelligence and optimization, this bilateral initiative will create synergistic value that neither group could achieve independently, positioning both partners at the forefront of the emerging field of quantum-enhanced evolutionary computation.</w:t>
       </w:r>
     </w:p>
     <w:p>
       <w:r>
-        <w:t>5. Identify Future Research Directions and Funding Opportunities: Map the landscape of open problems at the intersection of quantum computing and evolutionary computation, and identify appropriate funding mechanisms for larger-scale collaborative projects.</w:t>
-      </w:r>
-    </w:p>
-    <w:p>
-      <w:pPr>
-        <w:pStyle w:val="Heading1"/>
-      </w:pPr>
-      <w:r>
-        <w:t>3. Research Activities</w:t>
-      </w:r>
-    </w:p>
-    <w:p>
-      <w:pPr>
-        <w:pStyle w:val="Heading2"/>
-      </w:pPr>
-      <w:r>
-        <w:t>3.1 Researcher Mobility and Exchanges</w:t>
-      </w:r>
-    </w:p>
-    <w:p>
-      <w:pPr>
-        <w:pStyle w:val="ListBullet"/>
-      </w:pPr>
-      <w:r>
-        <w:t>Short-term research visits (2–4 weeks each) by senior researchers and postdoctoral fellows between the partner institutions.</w:t>
-      </w:r>
-    </w:p>
-    <w:p>
-      <w:pPr>
-        <w:pStyle w:val="ListBullet"/>
-      </w:pPr>
-      <w:r>
-        <w:t>Extended visits (4–8 weeks) by doctoral students to gain hands-on experience in the complementary research domain.</w:t>
-      </w:r>
-    </w:p>
-    <w:p>
-      <w:pPr>
-        <w:pStyle w:val="ListBullet"/>
-      </w:pPr>
-      <w:r>
-        <w:t>At least four mobility exchanges during the project period, with reciprocal visits in both directions.</w:t>
-      </w:r>
-    </w:p>
-    <w:p>
-      <w:pPr>
-        <w:pStyle w:val="Heading2"/>
-      </w:pPr>
-      <w:r>
-        <w:t>3.2 Joint Seminars and Workshops</w:t>
-      </w:r>
-    </w:p>
-    <w:p>
-      <w:pPr>
-        <w:pStyle w:val="ListBullet"/>
-      </w:pPr>
-      <w:r>
-        <w:t>Organization of two joint workshops (one at each partner institution) bringing together members of both research groups for intensive technical discussions.</w:t>
-      </w:r>
-    </w:p>
-    <w:p>
-      <w:pPr>
-        <w:pStyle w:val="ListBullet"/>
-      </w:pPr>
-      <w:r>
-        <w:t>Regular online seminars (monthly) to maintain momentum and discuss ongoing work.</w:t>
-      </w:r>
-    </w:p>
-    <w:p>
-      <w:pPr>
-        <w:pStyle w:val="ListBullet"/>
-      </w:pPr>
-      <w:r>
-        <w:t>Invited talks by external experts at the intersection of quantum computing and evolutionary algorithms.</w:t>
-      </w:r>
-    </w:p>
-    <w:p>
-      <w:pPr>
-        <w:pStyle w:val="Heading2"/>
-      </w:pPr>
-      <w:r>
-        <w:t>3.3 Knowledge and Resource Sharing</w:t>
-      </w:r>
-    </w:p>
-    <w:p>
-      <w:pPr>
-        <w:pStyle w:val="ListBullet"/>
-      </w:pPr>
-      <w:r>
-        <w:t>Exchange of software tools, including evolutionary algorithm libraries and quantum computing simulators/frameworks.</w:t>
-      </w:r>
-    </w:p>
-    <w:p>
-      <w:pPr>
-        <w:pStyle w:val="ListBullet"/>
-      </w:pPr>
-      <w:r>
-        <w:t>Sharing of benchmark datasets and problem instances for comparative studies.</w:t>
-      </w:r>
-    </w:p>
-    <w:p>
-      <w:pPr>
-        <w:pStyle w:val="ListBullet"/>
-      </w:pPr>
-      <w:r>
-        <w:t>Joint access to quantum computing resources (cloud-based quantum processors and simulators).</w:t>
-      </w:r>
-    </w:p>
-    <w:p>
-      <w:pPr>
-        <w:pStyle w:val="Heading2"/>
-      </w:pPr>
-      <w:r>
-        <w:t>3.4 Preliminary Feasibility Studies</w:t>
-      </w:r>
-    </w:p>
-    <w:p>
-      <w:pPr>
-        <w:pStyle w:val="ListBullet"/>
-      </w:pPr>
-      <w:r>
-        <w:t>Implementation and benchmarking of selected quantum-inspired evolutionary algorithms on standard optimization test suites.</w:t>
-      </w:r>
-    </w:p>
-    <w:p>
-      <w:pPr>
-        <w:pStyle w:val="ListBullet"/>
-      </w:pPr>
-      <w:r>
-        <w:t>Proof-of-concept experiments applying evolutionary optimization to small-scale quantum circuits.</w:t>
-      </w:r>
-    </w:p>
-    <w:p>
-      <w:pPr>
-        <w:pStyle w:val="ListBullet"/>
-      </w:pPr>
-      <w:r>
-        <w:t>Literature survey and position paper on the state of the art at the intersection of both fields.</w:t>
-      </w:r>
-    </w:p>
-    <w:p>
-      <w:pPr>
-        <w:pStyle w:val="Heading1"/>
-      </w:pPr>
-      <w:r>
-        <w:t>4. Expected Outcomes</w:t>
+        <w:t>The project timeline spans 24 months, structured in three phases: an initiation phase focused on knowledge exchange and identification of specific research problems; an active collaboration phase involving joint algorithm development, implementation, and preliminary experimentation; and a consolidation phase dedicated to publication of results, evaluation of outcomes, and strategic planning for continued collaboration. Throughout the project, regular virtual meetings, two physical workshops (one at each partner institution), and four researcher exchange visits will maintain momentum and ensure effective coordination between the two groups.</w:t>
       </w:r>
     </w:p>
     <w:p>
       <w:r>
-        <w:t>The following outcomes are anticipated upon completion of the mobility project:</w:t>
+        <w:t>This bilateral initiative represents a timely and strategically important investment in building Indo-Austrian research capacity at the intersection of two rapidly advancing fields. The complementary expertise of the two groups, combined with the structured mobility programme and shared commitment to open science, provides a strong foundation for achieving meaningful scientific advances while establishing a lasting collaborative partnership that will continue to bear fruit well beyond the project period.</w:t>
       </w:r>
     </w:p>
     <w:p>
       <w:r>
-        <w:t>1. Strengthened International Collaboration: A well-established research partnership with clear communication channels, shared research agenda, and mutual understanding of each group's capabilities.</w:t>
+        <w:br w:type="page"/>
+      </w:r>
+    </w:p>
+    <w:p>
+      <w:pPr>
+        <w:pStyle w:val="Heading1"/>
+      </w:pPr>
+      <w:r>
+        <w:t>2. Scientific Objectives</w:t>
       </w:r>
     </w:p>
     <w:p>
       <w:r>
-        <w:t>2. Joint Publications: At least 1–2 joint publications (conference papers or journal articles) reporting preliminary findings, survey results, or position papers on the integration of quantum computing and evolutionary algorithms.</w:t>
+        <w:t>The scientific objectives of this bilateral research initiative are designed to establish a rigorous collaborative framework for exploring the intersection of quantum computation and evolutionary algorithms, with the following specific goals:</w:t>
       </w:r>
     </w:p>
     <w:p>
       <w:r>
-        <w:t>3. Technical Reports: Internal technical reports documenting feasibility assessments, benchmark results, and identified research gaps.</w:t>
+        <w:rPr>
+          <w:b/>
+        </w:rPr>
+        <w:t>Objective 1: Development of Quantum-Inspired Evolutionary Algorithm Frameworks</w:t>
+        <w:br/>
+      </w:r>
+      <w:r>
+        <w:t>Design and implement novel quantum-inspired evolutionary algorithms that integrate quantum computing principles—including quantum-bit encoding, quantum rotation gates, superposition-based diversity mechanisms, and entanglement-inspired crossover operators—into classical evolutionary optimization. The goal is to develop algorithmic variants that demonstrably improve search performance on selected benchmark and real-world optimization problems compared to state-of-the-art classical evolutionary methods.</w:t>
       </w:r>
     </w:p>
     <w:p>
       <w:r>
-        <w:t>4. Identification of Promising Research Problems: A curated list of open problems and research questions suitable for larger-scale collaborative investigation.</w:t>
+        <w:rPr>
+          <w:b/>
+        </w:rPr>
+        <w:t>Objective 2: Evolutionary Optimization of Quantum Circuits</w:t>
+        <w:br/>
+      </w:r>
+      <w:r>
+        <w:t>Investigate and develop evolutionary approaches for the automated design and parameter optimization of quantum circuits, focusing on variational quantum algorithms (VQE, QAOA) and quantum machine learning circuits. This includes evolving circuit architectures, optimizing rotation angles, minimizing circuit depth, and discovering efficient quantum gate sequences for specific computational tasks.</w:t>
       </w:r>
     </w:p>
     <w:p>
       <w:r>
-        <w:t>5. Preparation of Larger Grant Proposals: At least one joint application submitted to national or international funding agencies for a full-scale collaborative research project.</w:t>
+        <w:rPr>
+          <w:b/>
+        </w:rPr>
+        <w:t>Objective 3: Hybrid Quantum-Classical Evolutionary Computation</w:t>
+        <w:br/>
+      </w:r>
+      <w:r>
+        <w:t>Explore frameworks for hybrid quantum-classical evolutionary algorithms that utilize quantum processors (real or simulated) as components within evolutionary loops. This includes quantum-enhanced fitness evaluation, quantum-assisted population initialization, and quantum-accelerated genetic operators, assessed for computational advantage on suitable problem classes.</w:t>
       </w:r>
     </w:p>
     <w:p>
       <w:r>
-        <w:t>6. Training and Capacity Building: Enhanced research skills for participating students and early-career researchers through exposure to interdisciplinary methodologies, international collaboration practices, and cutting-edge research topics.</w:t>
+        <w:rPr>
+          <w:b/>
+        </w:rPr>
+        <w:t>Objective 4: Theoretical Analysis and Convergence Properties</w:t>
+        <w:br/>
+      </w:r>
+      <w:r>
+        <w:t>Conduct theoretical investigations into the convergence behaviour, computational complexity, and scalability properties of quantum-inspired evolutionary algorithms. Develop mathematical frameworks for analysing when and why quantum-inspired mechanisms provide advantages over purely classical approaches.</w:t>
       </w:r>
     </w:p>
     <w:p>
       <w:r>
-        <w:t>7. Shared Expertise Development: Creation of tutorial materials, reading lists, and training modules accessible to both research groups for continued education and onboarding of new members.</w:t>
+        <w:rPr>
+          <w:b/>
+        </w:rPr>
+        <w:t>Objective 5: Software Platform Development and Empirical Benchmarking</w:t>
+        <w:br/>
       </w:r>
-    </w:p>
-    <w:p>
-      <w:pPr>
-        <w:pStyle w:val="Heading1"/>
-      </w:pPr>
       <w:r>
-        <w:t>5. Work Plan and Timeline</w:t>
+        <w:t>Extend the HeuristicLab platform with modules for quantum-inspired evolutionary algorithms and interfaces to quantum computing simulators. Conduct comprehensive empirical benchmarking comparing quantum-inspired approaches with classical state-of-the-art methods across diverse optimization problem classes, establishing rigorous experimental methodologies for this emerging field.</w:t>
       </w:r>
     </w:p>
     <w:p>
       <w:r>
-        <w:t>The project is structured over a 24-month period with the following milestones:</w:t>
+        <w:t>These objectives are interconnected and designed to advance both fundamental understanding and practical capabilities in quantum-evolutionary computation while building sustained collaborative capacity between the two research groups.</w:t>
       </w:r>
     </w:p>
     <w:p>
-      <w:pPr>
-        <w:pStyle w:val="Heading2"/>
-      </w:pPr>
       <w:r>
-        <w:t>Phase 1: Initiation and Planning (Months 1–6)</w:t>
+        <w:br w:type="page"/>
       </w:r>
     </w:p>
+    <w:p>
+      <w:pPr>
+        <w:pStyle w:val="Heading1"/>
+      </w:pPr>
+      <w:r>
+        <w:t>3. Current State of Research/Technology</w:t>
+      </w:r>
+    </w:p>
+    <w:p>
+      <w:pPr>
+        <w:pStyle w:val="Heading2"/>
+      </w:pPr>
+      <w:r>
+        <w:t>3.1 Quantum Computing: Current Landscape</w:t>
+      </w:r>
+    </w:p>
+    <w:p>
+      <w:r>
+        <w:t>Quantum computing has progressed dramatically from theoretical curiosity to practical engineering endeavour. Current NISQ devices from IBM, Google, IonQ, and other providers offer 50–1000+ qubit processors, though with limited coherence times and significant noise. The development of variational quantum algorithms—particularly the Variational Quantum Eigensolver (VQE) and the Quantum Approximate Optimization Algorithm (QAOA)—has established a practical paradigm for near-term quantum advantage, wherein parameterized quantum circuits are optimized using classical outer loops. These hybrid quantum-classical approaches represent natural integration points for evolutionary optimization methods.</w:t>
+      </w:r>
+    </w:p>
+    <w:p>
+      <w:r>
+        <w:t>Quantum machine learning has emerged as another active frontier, with parameterized quantum circuits serving as trainable models for classification, regression, and generative tasks. The challenge of quantum architecture search—automatically designing quantum circuit structures for specific learning tasks—mirrors classical neural architecture search problems and is well-suited to evolutionary exploration. Additionally, quantum error correction remains a critical challenge, with recent work demonstrating that evolutionary algorithms can discover novel error correction codes that outperform hand-designed alternatives.</w:t>
+      </w:r>
+    </w:p>
+    <w:p>
+      <w:pPr>
+        <w:pStyle w:val="Heading2"/>
+      </w:pPr>
+      <w:r>
+        <w:t>3.2 Evolutionary Algorithms: State of the Art</w:t>
+      </w:r>
+    </w:p>
+    <w:p>
+      <w:r>
+        <w:t>Evolutionary algorithms have reached a mature state of development, with well-understood theoretical foundations and extensive practical applications. Modern developments include adaptive operator selection, self-adaptive parameter control, surrogate-assisted optimization for expensive fitness evaluations, multi-objective and many-objective optimization, large-scale optimization methods, and algorithm configuration and selection. The HEAL group has made significant contributions to genetic programming, symbolic regression, and algorithm engineering through the HeuristicLab platform, which provides a modular, extensible environment for implementing, combining, and empirically evaluating metaheuristic algorithms.</w:t>
+      </w:r>
+    </w:p>
+    <w:p>
+      <w:r>
+        <w:t>Dr. Yadav's group at NIT Jalandhar has contributed novel algorithmic paradigms, including the Artificial Electric Field Algorithm (AEFA), which draws inspiration from electromagnetic interactions for global optimization, and neural network-inspired optimization methods. These contributions demonstrate the continued potential for innovation in metaheuristic design through novel conceptual inspirations—a philosophy that extends naturally to quantum-mechanical inspirations.</w:t>
+      </w:r>
+    </w:p>
+    <w:p>
+      <w:pPr>
+        <w:pStyle w:val="Heading2"/>
+      </w:pPr>
+      <w:r>
+        <w:t>3.3 Quantum-Inspired Evolutionary Algorithms</w:t>
+      </w:r>
+    </w:p>
+    <w:p>
+      <w:r>
+        <w:t>The field of quantum-inspired evolutionary algorithms originated with Han and Kim's seminal work on quantum-bit representation in genetic algorithms (2002), which demonstrated that encoding solutions as quantum bits (with probabilistic superposition of 0 and 1 states) and evolving them through quantum gate rotations could improve optimization performance. Since then, numerous variants have been developed:</w:t>
+      </w:r>
+    </w:p>
+    <w:p>
+      <w:pPr>
+        <w:pStyle w:val="ListBullet"/>
+      </w:pPr>
+      <w:r>
+        <w:t>Quantum-Inspired Genetic Algorithms (QIGA): Use qubit representation and quantum gate-based mutation operators to maintain population diversity and improve convergence.</w:t>
+      </w:r>
+    </w:p>
+    <w:p>
+      <w:pPr>
+        <w:pStyle w:val="ListBullet"/>
+      </w:pPr>
+      <w:r>
+        <w:t>Quantum-Inspired Differential Evolution (QDE): Incorporate quantum rotation operations into differential evolution frameworks for continuous optimization.</w:t>
+      </w:r>
+    </w:p>
+    <w:p>
+      <w:pPr>
+        <w:pStyle w:val="ListBullet"/>
+      </w:pPr>
+      <w:r>
+        <w:t>Quantum-Inspired Particle Swarm Optimization (QPSO): Leverage quantum mechanical uncertainty principles to enhance particle swarm dynamics.</w:t>
+      </w:r>
+    </w:p>
+    <w:p>
+      <w:pPr>
+        <w:pStyle w:val="ListBullet"/>
+      </w:pPr>
+      <w:r>
+        <w:t>Quantum-Inspired Evolutionary Strategies: Apply quantum superposition concepts to evolutionary strategy self-adaptation mechanisms.</w:t>
+      </w:r>
+    </w:p>
+    <w:p>
+      <w:r>
+        <w:t>Recent surveys (Zhang, 2011; Lu et al., 2022) have catalogued over 200 quantum-inspired algorithm variants, demonstrating their effectiveness across combinatorial optimization, continuous optimization, multi-objective optimization, and machine learning applications. However, significant open questions remain regarding: (a) which quantum concepts genuinely provide algorithmic advantages versus merely adding computational overhead; (b) rigorous theoretical analysis of when quantum inspiration translates to improved convergence or solution quality; and (c) fair empirical comparison methodologies that account for computational budget differences.</w:t>
+      </w:r>
+    </w:p>
+    <w:p>
+      <w:pPr>
+        <w:pStyle w:val="Heading2"/>
+      </w:pPr>
+      <w:r>
+        <w:t>3.4 Evolutionary Methods for Quantum Computing</w:t>
+      </w:r>
+    </w:p>
+    <w:p>
+      <w:r>
+        <w:t>The application of evolutionary algorithms to quantum computing problems is a more recent but rapidly growing research direction. Key developments include:</w:t>
+      </w:r>
+    </w:p>
+    <w:p>
+      <w:pPr>
+        <w:pStyle w:val="ListBullet"/>
+      </w:pPr>
+      <w:r>
+        <w:t>Quantum Circuit Optimization: Evolutionary algorithms have been applied to optimize quantum circuit depth, gate count, and layout for specific quantum algorithms.</w:t>
+      </w:r>
+    </w:p>
+    <w:p>
+      <w:pPr>
+        <w:pStyle w:val="ListBullet"/>
+      </w:pPr>
+      <w:r>
+        <w:t>Variational Parameter Optimization: Evolutionary approaches avoid barren plateau problems and can handle non-differentiable objectives, making them competitive for certain VQE and QAOA instances.</w:t>
+      </w:r>
+    </w:p>
+    <w:p>
+      <w:pPr>
+        <w:pStyle w:val="ListBullet"/>
+      </w:pPr>
+      <w:r>
+        <w:t>Quantum Architecture Search: Evolutionary neural architecture search methods have been adapted to discover optimal parameterized quantum circuit architectures.</w:t>
+      </w:r>
+    </w:p>
+    <w:p>
+      <w:pPr>
+        <w:pStyle w:val="ListBullet"/>
+      </w:pPr>
+      <w:r>
+        <w:t>Quantum Error Correction: Genetic algorithms have been used to discover new quantum error correction codes.</w:t>
+      </w:r>
+    </w:p>
+    <w:p>
+      <w:pPr>
+        <w:pStyle w:val="Heading2"/>
+      </w:pPr>
+      <w:r>
+        <w:t>3.5 Research Gaps and Opportunities</w:t>
+      </w:r>
+    </w:p>
+    <w:p>
+      <w:r>
+        <w:t>Despite significant progress, several critical gaps motivate this bilateral collaboration:</w:t>
+      </w:r>
+    </w:p>
+    <w:p>
+      <w:pPr>
+        <w:pStyle w:val="ListBullet"/>
+      </w:pPr>
+      <w:r>
+        <w:t>Limited cross-pollination between the evolutionary algorithm engineering community and the quantum computing community.</w:t>
+      </w:r>
+    </w:p>
+    <w:p>
+      <w:pPr>
+        <w:pStyle w:val="ListBullet"/>
+      </w:pPr>
+      <w:r>
+        <w:t>Insufficient rigorous benchmarking comparing quantum-inspired evolutionary algorithms against modern classical state-of-the-art methods.</w:t>
+      </w:r>
+    </w:p>
+    <w:p>
+      <w:pPr>
+        <w:pStyle w:val="ListBullet"/>
+      </w:pPr>
+      <w:r>
+        <w:t>Limited availability of open-source software platforms integrating quantum-inspired evolutionary algorithms with quantum computing simulators.</w:t>
+      </w:r>
+    </w:p>
+    <w:p>
+      <w:pPr>
+        <w:pStyle w:val="ListBullet"/>
+      </w:pPr>
+      <w:r>
+        <w:t>Underdeveloped theoretical understanding of the conditions under which quantum-inspired mechanisms provide genuine advantages.</w:t>
+      </w:r>
+    </w:p>
+    <w:p>
+      <w:r>
+        <w:t>This project directly addresses these gaps by combining HEAL's expertise in algorithm engineering with NIT Jalandhar's expertise in novel metaheuristic development.</w:t>
+      </w:r>
+    </w:p>
+    <w:p>
+      <w:r>
+        <w:br w:type="page"/>
+      </w:r>
+    </w:p>
+    <w:p>
+      <w:pPr>
+        <w:pStyle w:val="Heading1"/>
+      </w:pPr>
+      <w:r>
+        <w:t>4. Proposed Activities Including Methodology</w:t>
+      </w:r>
+    </w:p>
+    <w:p>
+      <w:pPr>
+        <w:pStyle w:val="Heading2"/>
+      </w:pPr>
+      <w:r>
+        <w:t>Phase 1: Knowledge Exchange and Problem Identification (Months 1–6)</w:t>
+      </w:r>
+    </w:p>
+    <w:p>
+      <w:r>
+        <w:t>The initial phase focuses on establishing shared understanding and identifying specific research problems:</w:t>
+      </w:r>
+    </w:p>
+    <w:p>
+      <w:pPr>
+        <w:pStyle w:val="ListBullet"/>
+      </w:pPr>
+      <w:r>
+        <w:t>Comprehensive literature survey conducted jointly, resulting in a state-of-the-art review paper.</w:t>
+      </w:r>
+    </w:p>
+    <w:p>
+      <w:pPr>
+        <w:pStyle w:val="ListBullet"/>
+      </w:pPr>
+      <w:r>
+        <w:t>Bilateral knowledge transfer seminars: HEAL presenting evolutionary algorithm engineering principles and HeuristicLab architecture; NIT Jalandhar presenting novel metaheuristic paradigms and quantum computing fundamentals.</w:t>
+      </w:r>
+    </w:p>
+    <w:p>
+      <w:pPr>
+        <w:pStyle w:val="ListBullet"/>
+      </w:pPr>
+      <w:r>
+        <w:t>Joint identification of 3–5 specific research problems selected based on scientific significance, feasibility, and alignment with both groups' expertise.</w:t>
+      </w:r>
+    </w:p>
+    <w:p>
+      <w:pPr>
+        <w:pStyle w:val="ListBullet"/>
+      </w:pPr>
+      <w:r>
+        <w:t>Definition of benchmark problem suites and evaluation criteria.</w:t>
+      </w:r>
+    </w:p>
+    <w:p>
+      <w:pPr>
+        <w:pStyle w:val="Heading2"/>
+      </w:pPr>
+      <w:r>
+        <w:t>Phase 2: Algorithm Development and Implementation (Months 7–18)</w:t>
+      </w:r>
+    </w:p>
+    <w:p>
+      <w:r>
+        <w:rPr>
+          <w:b/>
+        </w:rPr>
+        <w:t>Activity 2.1: Quantum-Inspired Algorithm Design</w:t>
+      </w:r>
+    </w:p>
+    <w:p>
+      <w:pPr>
+        <w:pStyle w:val="ListBullet"/>
+      </w:pPr>
+      <w:r>
+        <w:t>Design novel quantum-inspired evolutionary algorithms incorporating quantum-bit representation, quantum gate rotation operators, and superposition-based diversity mechanisms.</w:t>
+      </w:r>
+    </w:p>
+    <w:p>
+      <w:pPr>
+        <w:pStyle w:val="ListBullet"/>
+      </w:pPr>
+      <w:r>
+        <w:t>Investigate quantum entanglement-inspired crossover operators introducing correlation structures between solution components.</w:t>
+      </w:r>
+    </w:p>
+    <w:p>
+      <w:pPr>
+        <w:pStyle w:val="ListBullet"/>
+      </w:pPr>
+      <w:r>
+        <w:t>Develop quantum-inspired self-adaptation mechanisms leveraging quantum mechanical uncertainty principles.</w:t>
+      </w:r>
+    </w:p>
+    <w:p>
+      <w:r>
+        <w:rPr>
+          <w:b/>
+        </w:rPr>
+        <w:t>Activity 2.2: Evolutionary Quantum Circuit Optimization</w:t>
+      </w:r>
+    </w:p>
+    <w:p>
+      <w:pPr>
+        <w:pStyle w:val="ListBullet"/>
+      </w:pPr>
+      <w:r>
+        <w:t>Implement evolutionary approaches (genetic programming, grammatical evolution) for quantum circuit structure optimization.</w:t>
+      </w:r>
+    </w:p>
+    <w:p>
+      <w:pPr>
+        <w:pStyle w:val="ListBullet"/>
+      </w:pPr>
+      <w:r>
+        <w:t>Develop multi-objective evolutionary optimization frameworks for variational quantum circuits.</w:t>
+      </w:r>
+    </w:p>
+    <w:p>
+      <w:pPr>
+        <w:pStyle w:val="ListBullet"/>
+      </w:pPr>
+      <w:r>
+        <w:t>Apply AEFA-inspired approaches to parameter optimization in variational quantum algorithms.</w:t>
+      </w:r>
+    </w:p>
+    <w:p>
+      <w:r>
+        <w:rPr>
+          <w:b/>
+        </w:rPr>
+        <w:t>Activity 2.3: Hybrid Framework Development</w:t>
+      </w:r>
+    </w:p>
+    <w:p>
+      <w:pPr>
+        <w:pStyle w:val="ListBullet"/>
+      </w:pPr>
+      <w:r>
+        <w:t>Design software framework bridging HeuristicLab with quantum computing simulators (Qiskit, Cirq, PennyLane).</w:t>
+      </w:r>
+    </w:p>
+    <w:p>
+      <w:pPr>
+        <w:pStyle w:val="ListBullet"/>
+      </w:pPr>
+      <w:r>
+        <w:t>Investigate quantum-assisted fitness evaluation schemes.</w:t>
+      </w:r>
+    </w:p>
+    <w:p>
+      <w:pPr>
+        <w:pStyle w:val="ListBullet"/>
+      </w:pPr>
+      <w:r>
+        <w:t>Explore quantum random number generation for improved stochastic operator design.</w:t>
+      </w:r>
+    </w:p>
+    <w:p>
+      <w:r>
+        <w:rPr>
+          <w:b/>
+        </w:rPr>
+        <w:t>Activity 2.4: Theoretical Analysis</w:t>
+      </w:r>
+    </w:p>
+    <w:p>
+      <w:pPr>
+        <w:pStyle w:val="ListBullet"/>
+      </w:pPr>
+      <w:r>
+        <w:t>Develop convergence proofs for selected quantum-inspired evolutionary algorithms.</w:t>
+      </w:r>
+    </w:p>
+    <w:p>
+      <w:pPr>
+        <w:pStyle w:val="ListBullet"/>
+      </w:pPr>
+      <w:r>
+        <w:t>Analyse computational complexity and identify problem classes where quantum-inspired mechanisms provide provable advantages.</w:t>
+      </w:r>
+    </w:p>
+    <w:p>
+      <w:pPr>
+        <w:pStyle w:val="Heading2"/>
+      </w:pPr>
+      <w:r>
+        <w:t>Phase 3: Experimentation and Consolidation (Months 19–24)</w:t>
+      </w:r>
+    </w:p>
+    <w:p>
+      <w:pPr>
+        <w:pStyle w:val="ListBullet"/>
+      </w:pPr>
+      <w:r>
+        <w:t>Comprehensive benchmarking on standard optimization test suites using statistically rigorous protocols.</w:t>
+      </w:r>
+    </w:p>
+    <w:p>
+      <w:pPr>
+        <w:pStyle w:val="ListBullet"/>
+      </w:pPr>
+      <w:r>
+        <w:t>Application studies on real-world problems from both groups' domains.</w:t>
+      </w:r>
+    </w:p>
+    <w:p>
+      <w:pPr>
+        <w:pStyle w:val="ListBullet"/>
+      </w:pPr>
+      <w:r>
+        <w:t>Preparation and submission of joint publications.</w:t>
+      </w:r>
+    </w:p>
+    <w:p>
+      <w:pPr>
+        <w:pStyle w:val="ListBullet"/>
+      </w:pPr>
+      <w:r>
+        <w:t>Open-source release of all software modules.</w:t>
+      </w:r>
+    </w:p>
+    <w:p>
+      <w:pPr>
+        <w:pStyle w:val="ListBullet"/>
+      </w:pPr>
+      <w:r>
+        <w:t>Final project workshop and strategic planning.</w:t>
+      </w:r>
+    </w:p>
+    <w:p>
+      <w:pPr>
+        <w:pStyle w:val="Heading2"/>
+      </w:pPr>
+      <w:r>
+        <w:t>Mobility and Exchange Plan</w:t>
+      </w:r>
+    </w:p>
+    <w:p>
+      <w:pPr>
+        <w:pStyle w:val="ListBullet"/>
+      </w:pPr>
+      <w:r>
+        <w:t>Visit 1 (Month 3–4): Dr. Yadav visits HEAL Hagenberg (3 weeks).</w:t>
+      </w:r>
+    </w:p>
+    <w:p>
+      <w:pPr>
+        <w:pStyle w:val="ListBullet"/>
+      </w:pPr>
+      <w:r>
+        <w:t>Visit 2 (Month 8–9): HEAL postdoctoral researcher visits NIT Jalandhar (3 weeks).</w:t>
+      </w:r>
+    </w:p>
+    <w:p>
+      <w:pPr>
+        <w:pStyle w:val="ListBullet"/>
+      </w:pPr>
+      <w:r>
+        <w:t>Visit 3 (Month 13–14): NIT Jalandhar doctoral student visits HEAL (6 weeks).</w:t>
+      </w:r>
+    </w:p>
+    <w:p>
+      <w:pPr>
+        <w:pStyle w:val="ListBullet"/>
+      </w:pPr>
+      <w:r>
+        <w:t>Visit 4 (Month 18–19): Prof. Affenzeller visits NIT Jalandhar (2 weeks).</w:t>
+      </w:r>
+    </w:p>
+    <w:p>
+      <w:r>
+        <w:br w:type="page"/>
+      </w:r>
+    </w:p>
+    <w:p>
+      <w:pPr>
+        <w:pStyle w:val="Heading1"/>
+      </w:pPr>
+      <w:r>
+        <w:t>5. Detailed Description of Indo-Austrian Cooperation</w:t>
+      </w:r>
+    </w:p>
+    <w:p>
+      <w:pPr>
+        <w:pStyle w:val="Heading2"/>
+      </w:pPr>
+      <w:r>
+        <w:t>5.1 Complementary Expertise</w:t>
+      </w:r>
+    </w:p>
+    <w:p>
+      <w:r>
+        <w:t>The collaboration between HEAL (Austria) and NIT Jalandhar (India) is founded on deeply complementary expertise that creates synergistic value exceeding what either group could achieve independently.</w:t>
+      </w:r>
+    </w:p>
+    <w:p>
+      <w:r>
+        <w:rPr>
+          <w:b/>
+        </w:rPr>
+        <w:t xml:space="preserve">HEAL's Contributions: </w:t>
+      </w:r>
+      <w:r>
+        <w:t>Prof. Affenzeller's group brings over two decades of experience in evolutionary algorithm engineering: (a) systematic algorithm design using rigorous software engineering principles; (b) the HeuristicLab platform—a comprehensive, modular open-source environment; (c) genetic programming and symbolic regression expertise; (d) established methodologies for fair empirical comparison; and (e) extensive industry collaboration experience.</w:t>
+      </w:r>
+    </w:p>
+    <w:p>
+      <w:r>
+        <w:rPr>
+          <w:b/>
+        </w:rPr>
+        <w:t xml:space="preserve">NIT Jalandhar's Contributions: </w:t>
+      </w:r>
+      <w:r>
+        <w:t>Dr. Yadav's group contributes: (a) expertise in developing novel bio-inspired and physics-inspired optimization algorithms (AEFA, neural network algorithms); (b) strong mathematical foundations for algorithm analysis; (c) experience with soft computing and swarm intelligence; (d) growing capabilities in quantum computing; and (e) access to India's expanding quantum computing ecosystem.</w:t>
+      </w:r>
+    </w:p>
+    <w:p>
+      <w:pPr>
+        <w:pStyle w:val="Heading2"/>
+      </w:pPr>
+      <w:r>
+        <w:t>5.2 Strategic Rationale</w:t>
+      </w:r>
+    </w:p>
+    <w:p>
+      <w:pPr>
+        <w:pStyle w:val="ListBullet"/>
+      </w:pPr>
+      <w:r>
+        <w:t>Scientific Complementarity: Austria's strength in algorithm engineering complements India's strength in mathematical analysis and novel algorithm conception.</w:t>
+      </w:r>
+    </w:p>
+    <w:p>
+      <w:pPr>
+        <w:pStyle w:val="ListBullet"/>
+      </w:pPr>
+      <w:r>
+        <w:t>Geographical Diversity: Access to diverse academic networks, funding opportunities, and application domains.</w:t>
+      </w:r>
+    </w:p>
+    <w:p>
+      <w:pPr>
+        <w:pStyle w:val="ListBullet"/>
+      </w:pPr>
+      <w:r>
+        <w:t>Human Capital Development: Building capacity at the intersection of quantum technologies and AI—strategic priorities for both nations.</w:t>
+      </w:r>
+    </w:p>
+    <w:p>
+      <w:pPr>
+        <w:pStyle w:val="ListBullet"/>
+      </w:pPr>
+      <w:r>
+        <w:t>Institutional Alignment: Both institutions are applied research-oriented with strong industry connections.</w:t>
+      </w:r>
+    </w:p>
+    <w:p>
+      <w:pPr>
+        <w:pStyle w:val="Heading2"/>
+      </w:pPr>
+      <w:r>
+        <w:t>5.3 Bilateral Framework Advantages</w:t>
+      </w:r>
+    </w:p>
+    <w:p>
+      <w:r>
+        <w:t>The India-Austria Bilateral Programme provides an ideal framework by: enabling researcher mobility essential for deep knowledge transfer; providing institutional recognition; supporting the exploratory phase necessary before larger projects; and building personal relationships that sustain long-term partnerships.</w:t>
+      </w:r>
+    </w:p>
+    <w:p>
+      <w:r>
+        <w:br w:type="page"/>
+      </w:r>
+    </w:p>
+    <w:p>
+      <w:pPr>
+        <w:pStyle w:val="Heading1"/>
+      </w:pPr>
+      <w:r>
+        <w:t>6. Compatibility of Intentions of Both Sides</w:t>
+      </w:r>
+    </w:p>
+    <w:p>
+      <w:pPr>
+        <w:pStyle w:val="Heading2"/>
+      </w:pPr>
+      <w:r>
+        <w:t>6.1 Shared Research Vision</w:t>
+      </w:r>
+    </w:p>
+    <w:p>
+      <w:r>
+        <w:t>Both groups share a fundamental commitment to advancing metaheuristic optimization through rigorous scientific methodology, open-source software development, and interdisciplinary application.</w:t>
+      </w:r>
+    </w:p>
+    <w:p>
+      <w:r>
+        <w:rPr>
+          <w:b/>
+        </w:rPr>
+        <w:t xml:space="preserve">Prof. Affenzeller's Research Philosophy: </w:t>
+      </w:r>
+      <w:r>
+        <w:t>HEAL emphasizes algorithm engineering—systematic design, implementation, and evaluation using software engineering best practices. This philosophy naturally extends to quantum-inspired algorithms, bringing engineering rigour to an emerging field.</w:t>
+      </w:r>
+    </w:p>
+    <w:p>
+      <w:r>
+        <w:rPr>
+          <w:b/>
+        </w:rPr>
+        <w:t xml:space="preserve">Dr. Yadav's Research Philosophy: </w:t>
+      </w:r>
+      <w:r>
+        <w:t>The NIT Jalandhar group emphasizes creative algorithmic innovation drawing inspiration from diverse physical phenomena. The Artificial Electric Field Algorithm demonstrates extracting computational principles from physical systems—precisely the methodology for quantum-inspired algorithm design.</w:t>
+      </w:r>
+    </w:p>
+    <w:p>
+      <w:pPr>
+        <w:pStyle w:val="Heading2"/>
+      </w:pPr>
+      <w:r>
+        <w:t>6.2 Compatible Working Methods</w:t>
+      </w:r>
+    </w:p>
+    <w:p>
+      <w:pPr>
+        <w:pStyle w:val="ListBullet"/>
+      </w:pPr>
+      <w:r>
+        <w:t>Algorithm Design: Both follow systematic approaches from conceptual inspiration through formalization to implementation and evaluation.</w:t>
+      </w:r>
+    </w:p>
+    <w:p>
+      <w:pPr>
+        <w:pStyle w:val="ListBullet"/>
+      </w:pPr>
+      <w:r>
+        <w:t>Software Development: Both value well-engineered, reproducible research software. HeuristicLab provides a natural integration platform.</w:t>
+      </w:r>
+    </w:p>
+    <w:p>
+      <w:pPr>
+        <w:pStyle w:val="ListBullet"/>
+      </w:pPr>
+      <w:r>
+        <w:t>Empirical Evaluation: Both prioritize rigorous experimental evaluation with statistical testing and fair budget allocation.</w:t>
+      </w:r>
+    </w:p>
+    <w:p>
+      <w:pPr>
+        <w:pStyle w:val="ListBullet"/>
+      </w:pPr>
+      <w:r>
+        <w:t>Publication Strategy: Both target high-quality international journals and conferences.</w:t>
+      </w:r>
+    </w:p>
+    <w:p>
+      <w:pPr>
+        <w:pStyle w:val="Heading2"/>
+      </w:pPr>
+      <w:r>
+        <w:t>6.3 Role Distribution</w:t>
+      </w:r>
+    </w:p>
+    <w:p>
+      <w:pPr>
+        <w:pStyle w:val="ListBullet"/>
+      </w:pPr>
+      <w:r>
+        <w:t>HEAL (Austria): Leads software platform integration, empirical evaluation methodology, genetic programming for circuit optimization, industry applications.</w:t>
+      </w:r>
+    </w:p>
+    <w:p>
+      <w:pPr>
+        <w:pStyle w:val="ListBullet"/>
+      </w:pPr>
+      <w:r>
+        <w:t>NIT Jalandhar (India): Leads novel algorithm conception, mathematical convergence analysis, quantum computing integration, theoretical framework.</w:t>
+      </w:r>
+    </w:p>
+    <w:p>
+      <w:pPr>
+        <w:pStyle w:val="ListBullet"/>
+      </w:pPr>
+      <w:r>
+        <w:t>Joint: Literature surveys, benchmark design, workshop organization, publication writing, student supervision.</w:t>
+      </w:r>
+    </w:p>
+    <w:p>
+      <w:pPr>
+        <w:pStyle w:val="Heading2"/>
+      </w:pPr>
+      <w:r>
+        <w:t>6.4 Communication and Coordination</w:t>
+      </w:r>
+    </w:p>
+    <w:p>
+      <w:pPr>
+        <w:pStyle w:val="ListBullet"/>
+      </w:pPr>
+      <w:r>
+        <w:t>Bi-weekly video conferences for progress updates.</w:t>
+      </w:r>
+    </w:p>
+    <w:p>
+      <w:pPr>
+        <w:pStyle w:val="ListBullet"/>
+      </w:pPr>
+      <w:r>
+        <w:t>Shared project management tools (GitHub repositories, shared documents).</w:t>
+      </w:r>
+    </w:p>
+    <w:p>
+      <w:pPr>
+        <w:pStyle w:val="ListBullet"/>
+      </w:pPr>
+      <w:r>
+        <w:t>Quarterly milestone reviews.</w:t>
+      </w:r>
+    </w:p>
+    <w:p>
+      <w:pPr>
+        <w:pStyle w:val="ListBullet"/>
+      </w:pPr>
+      <w:r>
+        <w:t>Physical meetings during mobility visits for intensive work sessions.</w:t>
+      </w:r>
+    </w:p>
+    <w:p>
+      <w:r>
+        <w:br w:type="page"/>
+      </w:r>
+    </w:p>
+    <w:p>
+      <w:pPr>
+        <w:pStyle w:val="Heading1"/>
+      </w:pPr>
+      <w:r>
+        <w:t>7. Expected Results and Dissemination Plan</w:t>
+      </w:r>
+    </w:p>
+    <w:p>
+      <w:pPr>
+        <w:pStyle w:val="Heading2"/>
+      </w:pPr>
+      <w:r>
+        <w:t>7.1 Expected Outcomes</w:t>
+      </w:r>
+    </w:p>
+    <w:p>
+      <w:r>
+        <w:rPr>
+          <w:b/>
+        </w:rPr>
+        <w:t>Scientific Outcomes:</w:t>
+      </w:r>
+    </w:p>
+    <w:p>
+      <w:pPr>
+        <w:pStyle w:val="ListBullet"/>
+      </w:pPr>
+      <w:r>
+        <w:t>Novel Algorithms: 3–5 new quantum-inspired evolutionary algorithm variants, rigorously benchmarked against classical state-of-the-art methods.</w:t>
+      </w:r>
+    </w:p>
+    <w:p>
+      <w:pPr>
+        <w:pStyle w:val="ListBullet"/>
+      </w:pPr>
+      <w:r>
+        <w:t>Evolutionary Quantum Circuit Optimization: Validated evolutionary approaches for quantum circuit design and parameter optimization.</w:t>
+      </w:r>
+    </w:p>
+    <w:p>
+      <w:pPr>
+        <w:pStyle w:val="ListBullet"/>
+      </w:pPr>
+      <w:r>
+        <w:t>Theoretical Contributions: Convergence analysis providing conditions under which quantum-inspired mechanisms provably improve performance.</w:t>
+      </w:r>
+    </w:p>
+    <w:p>
+      <w:pPr>
+        <w:pStyle w:val="ListBullet"/>
+      </w:pPr>
+      <w:r>
+        <w:t>Software Platform: Open-source HeuristicLab extensions with quantum-inspired implementations and quantum simulator interfaces.</w:t>
+      </w:r>
+    </w:p>
+    <w:p>
+      <w:pPr>
+        <w:pStyle w:val="ListBullet"/>
+      </w:pPr>
+      <w:r>
+        <w:t>State-of-the-Art Review: Comprehensive survey of quantum-evolutionary computation.</w:t>
+      </w:r>
+    </w:p>
+    <w:p>
+      <w:r>
+        <w:rPr>
+          <w:b/>
+        </w:rPr>
+        <w:t>Collaborative Outcomes:</w:t>
+      </w:r>
+    </w:p>
+    <w:p>
+      <w:pPr>
+        <w:pStyle w:val="ListBullet"/>
+      </w:pPr>
+      <w:r>
+        <w:t>Established bilateral research partnership with shared infrastructure and joint strategic agenda.</w:t>
+      </w:r>
+    </w:p>
+    <w:p>
+      <w:pPr>
+        <w:pStyle w:val="ListBullet"/>
+      </w:pPr>
+      <w:r>
+        <w:t>Training of at least 2 doctoral students and 2 postdoctoral researchers.</w:t>
+      </w:r>
+    </w:p>
+    <w:p>
+      <w:pPr>
+        <w:pStyle w:val="ListBullet"/>
+      </w:pPr>
+      <w:r>
+        <w:t>At least 2 joint follow-up funding applications.</w:t>
+      </w:r>
+    </w:p>
+    <w:p>
+      <w:pPr>
+        <w:pStyle w:val="Heading2"/>
+      </w:pPr>
+      <w:r>
+        <w:t>7.2 Dissemination Plan</w:t>
+      </w:r>
+    </w:p>
+    <w:p>
+      <w:r>
+        <w:rPr>
+          <w:b/>
+        </w:rPr>
+        <w:t>Academic Dissemination:</w:t>
+      </w:r>
+    </w:p>
+    <w:p>
+      <w:pPr>
+        <w:pStyle w:val="ListBullet"/>
+      </w:pPr>
+      <w:r>
+        <w:t>Journal Publications (4–6): IEEE Trans. Evolutionary Computation, Evolutionary Computation, Swarm and Evolutionary Computation, Quantum Science and Technology, Applied Soft Computing.</w:t>
+      </w:r>
+    </w:p>
+    <w:p>
+      <w:pPr>
+        <w:pStyle w:val="ListBullet"/>
+      </w:pPr>
+      <w:r>
+        <w:t>Conference Presentations (4–6): GECCO, CEC, PPSN, IEEE Quantum Week.</w:t>
+      </w:r>
+    </w:p>
+    <w:p>
+      <w:pPr>
+        <w:pStyle w:val="ListBullet"/>
+      </w:pPr>
+      <w:r>
+        <w:t>All publications as open-access preprints on arXiv.</w:t>
+      </w:r>
+    </w:p>
+    <w:p>
+      <w:r>
+        <w:rPr>
+          <w:b/>
+        </w:rPr>
+        <w:t>Community Dissemination:</w:t>
+      </w:r>
+    </w:p>
+    <w:p>
+      <w:pPr>
+        <w:pStyle w:val="ListBullet"/>
+      </w:pPr>
+      <w:r>
+        <w:t>Two bilateral workshops with invited external speakers.</w:t>
+      </w:r>
+    </w:p>
+    <w:p>
+      <w:pPr>
+        <w:pStyle w:val="ListBullet"/>
+      </w:pPr>
+      <w:r>
+        <w:t>Joint tutorials at major conferences.</w:t>
+      </w:r>
+    </w:p>
+    <w:p>
+      <w:pPr>
+        <w:pStyle w:val="ListBullet"/>
+      </w:pPr>
+      <w:r>
+        <w:t>Online seminar series open to international participants.</w:t>
+      </w:r>
+    </w:p>
+    <w:p>
+      <w:r>
+        <w:rPr>
+          <w:b/>
+        </w:rPr>
+        <w:t>Open Science:</w:t>
+      </w:r>
+    </w:p>
+    <w:p>
+      <w:pPr>
+        <w:pStyle w:val="ListBullet"/>
+      </w:pPr>
+      <w:r>
+        <w:t>All algorithms released as open-source HeuristicLab modules (GPL v3).</w:t>
+      </w:r>
+    </w:p>
+    <w:p>
+      <w:pPr>
+        <w:pStyle w:val="ListBullet"/>
+      </w:pPr>
+      <w:r>
+        <w:t>Experimental data and benchmarks publicly available on GitHub.</w:t>
+      </w:r>
+    </w:p>
+    <w:p>
+      <w:pPr>
+        <w:pStyle w:val="ListBullet"/>
+      </w:pPr>
+      <w:r>
+        <w:t>Reproducibility packages for all published results.</w:t>
+      </w:r>
+    </w:p>
+    <w:p>
+      <w:r>
+        <w:rPr>
+          <w:b/>
+        </w:rPr>
+        <w:t>Knowledge Transfer to Industry:</w:t>
+      </w:r>
+    </w:p>
+    <w:p>
+      <w:pPr>
+        <w:pStyle w:val="ListBullet"/>
+      </w:pPr>
+      <w:r>
+        <w:t>Presentations at HEAL's industry symposia.</w:t>
+      </w:r>
+    </w:p>
+    <w:p>
+      <w:pPr>
+        <w:pStyle w:val="ListBullet"/>
+      </w:pPr>
+      <w:r>
+        <w:t>Engagement with India's quantum technology startups.</w:t>
+      </w:r>
+    </w:p>
+    <w:p>
+      <w:pPr>
+        <w:pStyle w:val="ListBullet"/>
+      </w:pPr>
+      <w:r>
+        <w:t>Development of industrially applicable quantum-enhanced optimization methods.</w:t>
+      </w:r>
+    </w:p>
+    <w:p>
+      <w:pPr>
+        <w:pStyle w:val="Heading2"/>
+      </w:pPr>
+      <w:r>
+        <w:t>7.3 Follow-on Interactions</w:t>
+      </w:r>
+    </w:p>
+    <w:p>
+      <w:pPr>
+        <w:pStyle w:val="ListBullet"/>
+      </w:pPr>
+      <w:r>
+        <w:t>Joint student supervision and exchange programmes beyond project period.</w:t>
+      </w:r>
+    </w:p>
+    <w:p>
+      <w:pPr>
+        <w:pStyle w:val="ListBullet"/>
+      </w:pPr>
+      <w:r>
+        <w:t>Shared grant applications to EU Horizon Europe, DST-FWF bilateral programmes.</w:t>
+      </w:r>
+    </w:p>
+    <w:p>
+      <w:pPr>
+        <w:pStyle w:val="ListBullet"/>
+      </w:pPr>
+      <w:r>
+        <w:t>Continued open-source software co-development.</w:t>
+      </w:r>
+    </w:p>
+    <w:p>
+      <w:pPr>
+        <w:pStyle w:val="ListBullet"/>
+      </w:pPr>
+      <w:r>
+        <w:t>Annual bilateral workshops alternating between India and Austria.</w:t>
+      </w:r>
+    </w:p>
+    <w:p>
+      <w:r>
+        <w:br w:type="page"/>
+      </w:r>
+    </w:p>
+    <w:p>
+      <w:pPr>
+        <w:pStyle w:val="Heading1"/>
+      </w:pPr>
+      <w:r>
+        <w:t>8. Major Milestones and Timeline</w:t>
+      </w:r>
+    </w:p>
+    <w:p>
+      <w:r>
+        <w:t>The project spans 24 months with the following major milestones:</w:t>
+      </w:r>
+    </w:p>
+    <w:p>
+      <w:pPr>
+        <w:pStyle w:val="Heading2"/>
+      </w:pPr>
+      <w:r>
+        <w:t>Phase 1: Initiation (Months 1–6)</w:t>
+      </w:r>
+    </w:p>
+    <w:p>
+      <w:r>
+        <w:rPr>
+          <w:b/>
+        </w:rPr>
+        <w:t>Milestone 1 (Month 2): Project Launch</w:t>
+      </w:r>
+    </w:p>
+    <w:p>
+      <w:pPr>
+        <w:pStyle w:val="ListBullet"/>
+      </w:pPr>
+      <w:r>
+        <w:t>Virtual kick-off meeting; communication protocols established; shared GitHub repository; detailed work plan; literature survey initiated.</w:t>
+      </w:r>
+    </w:p>
+    <w:p>
+      <w:r>
+        <w:rPr>
+          <w:b/>
+        </w:rPr>
+        <w:t>Milestone 2 (Month 4): First Mobility Visit</w:t>
+      </w:r>
+    </w:p>
+    <w:p>
+      <w:pPr>
+        <w:pStyle w:val="ListBullet"/>
+      </w:pPr>
+      <w:r>
+        <w:t>Dr. Yadav visits HEAL Hagenberg (3 weeks); knowledge exchange on HeuristicLab; research problems identified; collaborative algorithm design initiated.</w:t>
+      </w:r>
+    </w:p>
+    <w:p>
+      <w:r>
+        <w:rPr>
+          <w:b/>
+        </w:rPr>
+        <w:t>Milestone 3 (Month 6): Phase 1 Complete</w:t>
+      </w:r>
+    </w:p>
+    <w:p>
+      <w:pPr>
+        <w:pStyle w:val="ListBullet"/>
+      </w:pPr>
+      <w:r>
+        <w:t>Literature survey complete; review paper submitted; research problem definitions finalised; implementation phase planned.</w:t>
+      </w:r>
+    </w:p>
+    <w:p>
+      <w:pPr>
+        <w:pStyle w:val="Heading2"/>
+      </w:pPr>
+      <w:r>
+        <w:t>Phase 2: Active Research (Months 7–18)</w:t>
+      </w:r>
+    </w:p>
+    <w:p>
+      <w:r>
+        <w:rPr>
+          <w:b/>
+        </w:rPr>
+        <w:t>Milestone 4 (Month 9): Second Visit and Prototypes</w:t>
+      </w:r>
+    </w:p>
+    <w:p>
+      <w:pPr>
+        <w:pStyle w:val="ListBullet"/>
+      </w:pPr>
+      <w:r>
+        <w:t>HEAL postdoc visits NIT Jalandhar (3 weeks); first quantum-inspired algorithm prototypes; quantum computing knowledge transfer.</w:t>
+      </w:r>
+    </w:p>
+    <w:p>
+      <w:r>
+        <w:rPr>
+          <w:b/>
+        </w:rPr>
+        <w:t>Milestone 5 (Month 12): Mid-Project Review</w:t>
+      </w:r>
+    </w:p>
+    <w:p>
+      <w:pPr>
+        <w:pStyle w:val="ListBullet"/>
+      </w:pPr>
+      <w:r>
+        <w:t>First implementations complete; preliminary benchmarking; quantum circuit optimization prototype; first technical report.</w:t>
+      </w:r>
+    </w:p>
+    <w:p>
+      <w:r>
+        <w:rPr>
+          <w:b/>
+        </w:rPr>
+        <w:t>Milestone 6 (Month 14): Third Visit</w:t>
+      </w:r>
+    </w:p>
+    <w:p>
+      <w:pPr>
+        <w:pStyle w:val="ListBullet"/>
+      </w:pPr>
+      <w:r>
+        <w:t>NIT Jalandhar doctoral student visits HEAL (6 weeks); HeuristicLab extension implementation; quantum simulator integration; benchmarking.</w:t>
+      </w:r>
+    </w:p>
+    <w:p>
+      <w:r>
+        <w:rPr>
+          <w:b/>
+        </w:rPr>
+        <w:t>Milestone 7 (Month 18): Phase 2 Complete</w:t>
+      </w:r>
+    </w:p>
+    <w:p>
+      <w:pPr>
+        <w:pStyle w:val="ListBullet"/>
+      </w:pPr>
+      <w:r>
+        <w:t>All algorithms implemented and tested; hybrid framework operational; Prof. Affenzeller visits NIT Jalandhar for joint workshop.</w:t>
+      </w:r>
+    </w:p>
+    <w:p>
+      <w:pPr>
+        <w:pStyle w:val="Heading2"/>
+      </w:pPr>
+      <w:r>
+        <w:t>Phase 3: Consolidation (Months 19–24)</w:t>
+      </w:r>
+    </w:p>
+    <w:p>
+      <w:r>
+        <w:rPr>
+          <w:b/>
+        </w:rPr>
+        <w:t>Milestone 8 (Month 20): Joint Workshop</w:t>
+      </w:r>
+    </w:p>
+    <w:p>
+      <w:pPr>
+        <w:pStyle w:val="ListBullet"/>
+      </w:pPr>
+      <w:r>
+        <w:t>Bilateral workshop at NIT Jalandhar; results presentation; invited speakers; future directions discussed.</w:t>
+      </w:r>
+    </w:p>
+    <w:p>
+      <w:r>
+        <w:rPr>
+          <w:b/>
+        </w:rPr>
+        <w:t>Milestone 9 (Month 22): Publications</w:t>
+      </w:r>
+    </w:p>
+    <w:p>
+      <w:pPr>
+        <w:pStyle w:val="ListBullet"/>
+      </w:pPr>
+      <w:r>
+        <w:t>2–3 journal papers submitted; follow-up grant applications submitted; software open-source release.</w:t>
+      </w:r>
+    </w:p>
+    <w:p>
+      <w:r>
+        <w:rPr>
+          <w:b/>
+        </w:rPr>
+        <w:t>Milestone 10 (Month 24): Project Completion</w:t>
+      </w:r>
+    </w:p>
+    <w:p>
+      <w:pPr>
+        <w:pStyle w:val="ListBullet"/>
+      </w:pPr>
+      <w:r>
+        <w:t>Final meeting; second workshop at HEAL Hagenberg; final report; strategic roadmap for continued collaboration.</w:t>
+      </w:r>
+    </w:p>
+    <w:p/>
     <w:tbl>
       <w:tblPr>
         <w:tblStyle w:val="TableGrid"/>
@@ -346,13 +1433,14 @@
         <w:tblLook w:firstColumn="1" w:firstRow="1" w:lastColumn="0" w:lastRow="0" w:noHBand="0" w:noVBand="1" w:val="04A0"/>
       </w:tblPr>
       <w:tblGrid>
-        <w:gridCol w:w="4680"/>
-        <w:gridCol w:w="4680"/>
+        <w:gridCol w:w="3120"/>
+        <w:gridCol w:w="3120"/>
+        <w:gridCol w:w="3120"/>
       </w:tblGrid>
       <w:tr>
         <w:tc>
           <w:tcPr>
-            <w:tcW w:type="dxa" w:w="4680"/>
+            <w:tcW w:type="dxa" w:w="3120"/>
           </w:tcPr>
           <w:p>
             <w:r>
@@ -362,11 +1450,21 @@
         </w:tc>
         <w:tc>
           <w:tcPr>
-            <w:tcW w:type="dxa" w:w="4680"/>
+            <w:tcW w:type="dxa" w:w="3120"/>
           </w:tcPr>
           <w:p>
             <w:r>
-              <w:t>Activity</w:t>
+              <w:t>Milestone</w:t>
+            </w:r>
+          </w:p>
+        </w:tc>
+        <w:tc>
+          <w:tcPr>
+            <w:tcW w:type="dxa" w:w="3120"/>
+          </w:tcPr>
+          <w:p>
+            <w:r>
+              <w:t>Key Deliverable</w:t>
             </w:r>
           </w:p>
         </w:tc>
@@ -374,21 +1472,31 @@
       <w:tr>
         <w:tc>
           <w:tcPr>
-            <w:tcW w:type="dxa" w:w="4680"/>
+            <w:tcW w:type="dxa" w:w="3120"/>
           </w:tcPr>
           <w:p>
             <w:r>
-              <w:t>1–2</w:t>
+              <w:t>2</w:t>
             </w:r>
           </w:p>
         </w:tc>
         <w:tc>
           <w:tcPr>
-            <w:tcW w:type="dxa" w:w="4680"/>
+            <w:tcW w:type="dxa" w:w="3120"/>
           </w:tcPr>
           <w:p>
             <w:r>
-              <w:t>Kick-off meeting (virtual); define detailed work plan and communication protocols</w:t>
+              <w:t>Project Launch</w:t>
+            </w:r>
+          </w:p>
+        </w:tc>
+        <w:tc>
+          <w:tcPr>
+            <w:tcW w:type="dxa" w:w="3120"/>
+          </w:tcPr>
+          <w:p>
+            <w:r>
+              <w:t>Work plan, communication framework</w:t>
             </w:r>
           </w:p>
         </w:tc>
@@ -396,21 +1504,31 @@
       <w:tr>
         <w:tc>
           <w:tcPr>
-            <w:tcW w:type="dxa" w:w="4680"/>
+            <w:tcW w:type="dxa" w:w="3120"/>
           </w:tcPr>
           <w:p>
             <w:r>
-              <w:t>3–4</w:t>
+              <w:t>4</w:t>
             </w:r>
           </w:p>
         </w:tc>
         <w:tc>
           <w:tcPr>
-            <w:tcW w:type="dxa" w:w="4680"/>
+            <w:tcW w:type="dxa" w:w="3120"/>
           </w:tcPr>
           <w:p>
             <w:r>
-              <w:t>First mobility visit: Senior researcher from Group A visits Group B (2 weeks)</w:t>
+              <w:t>First Visit (India→Austria)</w:t>
+            </w:r>
+          </w:p>
+        </w:tc>
+        <w:tc>
+          <w:tcPr>
+            <w:tcW w:type="dxa" w:w="3120"/>
+          </w:tcPr>
+          <w:p>
+            <w:r>
+              <w:t>Knowledge exchange report</w:t>
             </w:r>
           </w:p>
         </w:tc>
@@ -418,63 +1536,31 @@
       <w:tr>
         <w:tc>
           <w:tcPr>
-            <w:tcW w:type="dxa" w:w="4680"/>
+            <w:tcW w:type="dxa" w:w="3120"/>
           </w:tcPr>
           <w:p>
             <w:r>
-              <w:t>5–6</w:t>
+              <w:t>6</w:t>
             </w:r>
           </w:p>
         </w:tc>
         <w:tc>
           <w:tcPr>
-            <w:tcW w:type="dxa" w:w="4680"/>
+            <w:tcW w:type="dxa" w:w="3120"/>
           </w:tcPr>
           <w:p>
             <w:r>
-              <w:t>Literature review and identification of candidate algorithms for feasibility studies</w:t>
-            </w:r>
-          </w:p>
-        </w:tc>
-      </w:tr>
-    </w:tbl>
-    <w:p/>
-    <w:p>
-      <w:pPr>
-        <w:pStyle w:val="Heading2"/>
-      </w:pPr>
-      <w:r>
-        <w:t>Phase 2: Active Collaboration (Months 7–18)</w:t>
-      </w:r>
-    </w:p>
-    <w:tbl>
-      <w:tblPr>
-        <w:tblStyle w:val="TableGrid"/>
-        <w:tblW w:type="auto" w:w="0"/>
-        <w:tblLook w:firstColumn="1" w:firstRow="1" w:lastColumn="0" w:lastRow="0" w:noHBand="0" w:noVBand="1" w:val="04A0"/>
-      </w:tblPr>
-      <w:tblGrid>
-        <w:gridCol w:w="4680"/>
-        <w:gridCol w:w="4680"/>
-      </w:tblGrid>
-      <w:tr>
-        <w:tc>
-          <w:tcPr>
-            <w:tcW w:type="dxa" w:w="4680"/>
-          </w:tcPr>
-          <w:p>
-            <w:r>
-              <w:t>Month</w:t>
+              <w:t>Phase 1 Complete</w:t>
             </w:r>
           </w:p>
         </w:tc>
         <w:tc>
           <w:tcPr>
-            <w:tcW w:type="dxa" w:w="4680"/>
+            <w:tcW w:type="dxa" w:w="3120"/>
           </w:tcPr>
           <w:p>
             <w:r>
-              <w:t>Activity</w:t>
+              <w:t>Survey paper submitted</w:t>
             </w:r>
           </w:p>
         </w:tc>
@@ -482,21 +1568,31 @@
       <w:tr>
         <w:tc>
           <w:tcPr>
-            <w:tcW w:type="dxa" w:w="4680"/>
+            <w:tcW w:type="dxa" w:w="3120"/>
           </w:tcPr>
           <w:p>
             <w:r>
-              <w:t>7–8</w:t>
+              <w:t>9</w:t>
             </w:r>
           </w:p>
         </w:tc>
         <w:tc>
           <w:tcPr>
-            <w:tcW w:type="dxa" w:w="4680"/>
+            <w:tcW w:type="dxa" w:w="3120"/>
           </w:tcPr>
           <w:p>
             <w:r>
-              <w:t>First joint workshop at Partner Institution A</w:t>
+              <w:t>Second Visit (Austria→India)</w:t>
+            </w:r>
+          </w:p>
+        </w:tc>
+        <w:tc>
+          <w:tcPr>
+            <w:tcW w:type="dxa" w:w="3120"/>
+          </w:tcPr>
+          <w:p>
+            <w:r>
+              <w:t>Algorithm prototypes</w:t>
             </w:r>
           </w:p>
         </w:tc>
@@ -504,21 +1600,31 @@
       <w:tr>
         <w:tc>
           <w:tcPr>
-            <w:tcW w:type="dxa" w:w="4680"/>
+            <w:tcW w:type="dxa" w:w="3120"/>
           </w:tcPr>
           <w:p>
             <w:r>
-              <w:t>9–10</w:t>
+              <w:t>12</w:t>
             </w:r>
           </w:p>
         </w:tc>
         <w:tc>
           <w:tcPr>
-            <w:tcW w:type="dxa" w:w="4680"/>
+            <w:tcW w:type="dxa" w:w="3120"/>
           </w:tcPr>
           <w:p>
             <w:r>
-              <w:t>Doctoral student exchange: Student from Group B visits Group A (6 weeks)</w:t>
+              <w:t>Mid-Project Review</w:t>
+            </w:r>
+          </w:p>
+        </w:tc>
+        <w:tc>
+          <w:tcPr>
+            <w:tcW w:type="dxa" w:w="3120"/>
+          </w:tcPr>
+          <w:p>
+            <w:r>
+              <w:t>Technical report, preliminary results</w:t>
             </w:r>
           </w:p>
         </w:tc>
@@ -526,21 +1632,31 @@
       <w:tr>
         <w:tc>
           <w:tcPr>
-            <w:tcW w:type="dxa" w:w="4680"/>
+            <w:tcW w:type="dxa" w:w="3120"/>
           </w:tcPr>
           <w:p>
             <w:r>
-              <w:t>11–12</w:t>
+              <w:t>14</w:t>
             </w:r>
           </w:p>
         </w:tc>
         <w:tc>
           <w:tcPr>
-            <w:tcW w:type="dxa" w:w="4680"/>
+            <w:tcW w:type="dxa" w:w="3120"/>
           </w:tcPr>
           <w:p>
             <w:r>
-              <w:t>Preliminary feasibility experiments; mid-project review meeting (virtual)</w:t>
+              <w:t>Third Visit (Student India→Austria)</w:t>
+            </w:r>
+          </w:p>
+        </w:tc>
+        <w:tc>
+          <w:tcPr>
+            <w:tcW w:type="dxa" w:w="3120"/>
+          </w:tcPr>
+          <w:p>
+            <w:r>
+              <w:t>HeuristicLab extensions</w:t>
             </w:r>
           </w:p>
         </w:tc>
@@ -548,21 +1664,31 @@
       <w:tr>
         <w:tc>
           <w:tcPr>
-            <w:tcW w:type="dxa" w:w="4680"/>
+            <w:tcW w:type="dxa" w:w="3120"/>
           </w:tcPr>
           <w:p>
             <w:r>
-              <w:t>13–14</w:t>
+              <w:t>18</w:t>
             </w:r>
           </w:p>
         </w:tc>
         <w:tc>
           <w:tcPr>
-            <w:tcW w:type="dxa" w:w="4680"/>
+            <w:tcW w:type="dxa" w:w="3120"/>
           </w:tcPr>
           <w:p>
             <w:r>
-              <w:t>Second mobility visit: Senior researcher from Group B visits Group A (2 weeks)</w:t>
+              <w:t>Phase 2 Complete + Fourth Visit</w:t>
+            </w:r>
+          </w:p>
+        </w:tc>
+        <w:tc>
+          <w:tcPr>
+            <w:tcW w:type="dxa" w:w="3120"/>
+          </w:tcPr>
+          <w:p>
+            <w:r>
+              <w:t>All algorithms implemented</w:t>
             </w:r>
           </w:p>
         </w:tc>
@@ -570,21 +1696,31 @@
       <w:tr>
         <w:tc>
           <w:tcPr>
-            <w:tcW w:type="dxa" w:w="4680"/>
+            <w:tcW w:type="dxa" w:w="3120"/>
           </w:tcPr>
           <w:p>
             <w:r>
-              <w:t>15–16</w:t>
+              <w:t>20</w:t>
             </w:r>
           </w:p>
         </w:tc>
         <w:tc>
           <w:tcPr>
-            <w:tcW w:type="dxa" w:w="4680"/>
+            <w:tcW w:type="dxa" w:w="3120"/>
           </w:tcPr>
           <w:p>
             <w:r>
-              <w:t>Second joint workshop at Partner Institution B</w:t>
+              <w:t>Joint Workshop (India)</w:t>
+            </w:r>
+          </w:p>
+        </w:tc>
+        <w:tc>
+          <w:tcPr>
+            <w:tcW w:type="dxa" w:w="3120"/>
+          </w:tcPr>
+          <w:p>
+            <w:r>
+              <w:t>Workshop proceedings</w:t>
             </w:r>
           </w:p>
         </w:tc>
@@ -592,63 +1728,31 @@
       <w:tr>
         <w:tc>
           <w:tcPr>
-            <w:tcW w:type="dxa" w:w="4680"/>
+            <w:tcW w:type="dxa" w:w="3120"/>
           </w:tcPr>
           <w:p>
             <w:r>
-              <w:t>17–18</w:t>
+              <w:t>22</w:t>
             </w:r>
           </w:p>
         </w:tc>
         <w:tc>
           <w:tcPr>
-            <w:tcW w:type="dxa" w:w="4680"/>
+            <w:tcW w:type="dxa" w:w="3120"/>
           </w:tcPr>
           <w:p>
             <w:r>
-              <w:t>Doctoral student exchange: Student from Group A visits Group B (6 weeks)</w:t>
-            </w:r>
-          </w:p>
-        </w:tc>
-      </w:tr>
-    </w:tbl>
-    <w:p/>
-    <w:p>
-      <w:pPr>
-        <w:pStyle w:val="Heading2"/>
-      </w:pPr>
-      <w:r>
-        <w:t>Phase 3: Consolidation and Future Planning (Months 19–24)</w:t>
-      </w:r>
-    </w:p>
-    <w:tbl>
-      <w:tblPr>
-        <w:tblStyle w:val="TableGrid"/>
-        <w:tblW w:type="auto" w:w="0"/>
-        <w:tblLook w:firstColumn="1" w:firstRow="1" w:lastColumn="0" w:lastRow="0" w:noHBand="0" w:noVBand="1" w:val="04A0"/>
-      </w:tblPr>
-      <w:tblGrid>
-        <w:gridCol w:w="4680"/>
-        <w:gridCol w:w="4680"/>
-      </w:tblGrid>
-      <w:tr>
-        <w:tc>
-          <w:tcPr>
-            <w:tcW w:type="dxa" w:w="4680"/>
-          </w:tcPr>
-          <w:p>
-            <w:r>
-              <w:t>Month</w:t>
+              <w:t>Publications Submitted</w:t>
             </w:r>
           </w:p>
         </w:tc>
         <w:tc>
           <w:tcPr>
-            <w:tcW w:type="dxa" w:w="4680"/>
+            <w:tcW w:type="dxa" w:w="3120"/>
           </w:tcPr>
           <w:p>
             <w:r>
-              <w:t>Activity</w:t>
+              <w:t>Journal papers, grant applications</w:t>
             </w:r>
           </w:p>
         </w:tc>
@@ -656,93 +1760,55 @@
       <w:tr>
         <w:tc>
           <w:tcPr>
-            <w:tcW w:type="dxa" w:w="4680"/>
+            <w:tcW w:type="dxa" w:w="3120"/>
           </w:tcPr>
           <w:p>
             <w:r>
-              <w:t>19–20</w:t>
+              <w:t>24</w:t>
             </w:r>
           </w:p>
         </w:tc>
         <w:tc>
           <w:tcPr>
-            <w:tcW w:type="dxa" w:w="4680"/>
+            <w:tcW w:type="dxa" w:w="3120"/>
           </w:tcPr>
           <w:p>
             <w:r>
-              <w:t>Preparation of joint publications and technical reports</w:t>
-            </w:r>
-          </w:p>
-        </w:tc>
-      </w:tr>
-      <w:tr>
-        <w:tc>
-          <w:tcPr>
-            <w:tcW w:type="dxa" w:w="4680"/>
-          </w:tcPr>
-          <w:p>
-            <w:r>
-              <w:t>21–22</w:t>
+              <w:t>Project Completion</w:t>
             </w:r>
           </w:p>
         </w:tc>
         <w:tc>
           <w:tcPr>
-            <w:tcW w:type="dxa" w:w="4680"/>
+            <w:tcW w:type="dxa" w:w="3120"/>
           </w:tcPr>
           <w:p>
             <w:r>
-              <w:t>Drafting of larger collaborative grant proposal</w:t>
-            </w:r>
-          </w:p>
-        </w:tc>
-      </w:tr>
-      <w:tr>
-        <w:tc>
-          <w:tcPr>
-            <w:tcW w:type="dxa" w:w="4680"/>
-          </w:tcPr>
-          <w:p>
-            <w:r>
-              <w:t>23–24</w:t>
-            </w:r>
-          </w:p>
-        </w:tc>
-        <w:tc>
-          <w:tcPr>
-            <w:tcW w:type="dxa" w:w="4680"/>
-          </w:tcPr>
-          <w:p>
-            <w:r>
-              <w:t>Final project meeting; dissemination of results; strategic planning for continuation</w:t>
+              <w:t>Final report, software release</w:t>
             </w:r>
           </w:p>
         </w:tc>
       </w:tr>
     </w:tbl>
-    <w:p/>
     <w:p>
-      <w:pPr>
-        <w:pStyle w:val="ListBullet"/>
-      </w:pPr>
       <w:r>
-        <w:t>Continuous Activities (throughout the project):</w:t>
+        <w:br w:type="page"/>
       </w:r>
     </w:p>
     <w:p>
       <w:pPr>
-        <w:pStyle w:val="ListBullet"/>
+        <w:pStyle w:val="Heading1"/>
       </w:pPr>
       <w:r>
-        <w:t>Monthly online seminars</w:t>
+        <w:t>9. Expected Results of the Cooperation</w:t>
       </w:r>
     </w:p>
     <w:p>
       <w:pPr>
-        <w:pStyle w:val="ListBullet"/>
+        <w:pStyle w:val="Heading2"/>
       </w:pPr>
       <w:r>
-        <w:t>Regular communication and coordination</w:t>
+        <w:t>9.1 Joint Publications</w:t>
       </w:r>
     </w:p>
     <w:p>
@@ -750,28 +1816,44 @@
         <w:pStyle w:val="ListBullet"/>
       </w:pPr>
       <w:r>
-        <w:t>Sharing of resources and tools</w:t>
+        <w:t>Survey/Review Paper (1): Comprehensive review submitted to Artificial Intelligence Review or ACM Computing Surveys.</w:t>
       </w:r>
     </w:p>
     <w:p>
       <w:pPr>
-        <w:pStyle w:val="Heading1"/>
+        <w:pStyle w:val="ListBullet"/>
       </w:pPr>
       <w:r>
-        <w:t>6. Impact</w:t>
+        <w:t>Algorithm Papers (2–3): Novel quantum-inspired evolutionary algorithms, targeting IEEE Trans. Evolutionary Computation or Swarm and Evolutionary Computation.</w:t>
       </w:r>
     </w:p>
     <w:p>
       <w:pPr>
-        <w:pStyle w:val="Heading2"/>
+        <w:pStyle w:val="ListBullet"/>
       </w:pPr>
       <w:r>
-        <w:t>6.1 Scientific Impact</w:t>
+        <w:t>Application Paper (1): Evolutionary quantum circuit optimization, targeting Quantum Science and Technology.</w:t>
+      </w:r>
+    </w:p>
+    <w:p>
+      <w:pPr>
+        <w:pStyle w:val="ListBullet"/>
+      </w:pPr>
+      <w:r>
+        <w:t>Conference Papers (3–4): GECCO, CEC, PPSN, or IEEE Quantum Week.</w:t>
+      </w:r>
+    </w:p>
+    <w:p>
+      <w:pPr>
+        <w:pStyle w:val="ListBullet"/>
+      </w:pPr>
+      <w:r>
+        <w:t>Technical Reports (2): Benchmark results and software documentation.</w:t>
       </w:r>
     </w:p>
     <w:p>
       <w:r>
-        <w:t>This mobility initiative will contribute to the advancement of knowledge at the intersection of quantum computing and evolutionary computation—a rapidly growing area with significant untapped potential. By bringing together complementary expertise, the collaboration will accelerate the identification of viable research directions that neither group could pursue independently. The preliminary results obtained during this project will inform the design of larger, more ambitious research programs.</w:t>
+        <w:t>Total expected: 7–11 publications across journals, conferences, and technical reports.</w:t>
       </w:r>
     </w:p>
     <w:p>
@@ -779,12 +1861,44 @@
         <w:pStyle w:val="Heading2"/>
       </w:pPr>
       <w:r>
-        <w:t>6.2 Capacity Building and Knowledge Transfer</w:t>
+        <w:t>9.2 Software and Technical Outputs</w:t>
+      </w:r>
+    </w:p>
+    <w:p>
+      <w:pPr>
+        <w:pStyle w:val="ListBullet"/>
+      </w:pPr>
+      <w:r>
+        <w:t>HeuristicLab Extensions: Open-source modules for quantum-inspired evolutionary algorithms and quantum simulator interfaces.</w:t>
+      </w:r>
+    </w:p>
+    <w:p>
+      <w:pPr>
+        <w:pStyle w:val="ListBullet"/>
+      </w:pPr>
+      <w:r>
+        <w:t>Benchmark Suite: Standardised problems and evaluation protocols for community use.</w:t>
+      </w:r>
+    </w:p>
+    <w:p>
+      <w:pPr>
+        <w:pStyle w:val="ListBullet"/>
+      </w:pPr>
+      <w:r>
+        <w:t>Reproducibility Packages: Complete experimental setups for all published results.</w:t>
+      </w:r>
+    </w:p>
+    <w:p>
+      <w:pPr>
+        <w:pStyle w:val="Heading2"/>
+      </w:pPr>
+      <w:r>
+        <w:t>9.3 Patents and Commercial Value</w:t>
       </w:r>
     </w:p>
     <w:p>
       <w:r>
-        <w:t>The project will directly enhance the research capabilities of both groups through:</w:t>
+        <w:t>While the primary focus is fundamental research, certain outcomes may have commercial potential:</w:t>
       </w:r>
     </w:p>
     <w:p>
@@ -792,7 +1906,7 @@
         <w:pStyle w:val="ListBullet"/>
       </w:pPr>
       <w:r>
-        <w:t>Cross-training of researchers in quantum computing and evolutionary algorithm methodologies.</w:t>
+        <w:t>Quantum-Enhanced Optimization Methods: Algorithms for production scheduling, logistics, and resource allocation may be commercially valuable for manufacturing and supply chain applications.</w:t>
       </w:r>
     </w:p>
     <w:p>
@@ -800,28 +1914,20 @@
         <w:pStyle w:val="ListBullet"/>
       </w:pPr>
       <w:r>
-        <w:t>Development of interdisciplinary skills among doctoral students and early-career researchers.</w:t>
+        <w:t>Quantum Circuit Optimization Tools: Software for automated quantum circuit design could have commercial value as quantum platforms mature.</w:t>
       </w:r>
     </w:p>
     <w:p>
       <w:pPr>
-        <w:pStyle w:val="ListBullet"/>
+        <w:pStyle w:val="Heading2"/>
       </w:pPr>
       <w:r>
-        <w:t>Creation of lasting professional networks that extend beyond the project duration.</w:t>
-      </w:r>
-    </w:p>
-    <w:p>
-      <w:pPr>
-        <w:pStyle w:val="Heading2"/>
-      </w:pPr>
-      <w:r>
-        <w:t>6.3 Societal Impact</w:t>
+        <w:t>9.4 Sharing of Commercial Results</w:t>
       </w:r>
     </w:p>
     <w:p>
       <w:r>
-        <w:t>In the longer term, the integration of quantum computing and evolutionary algorithms has the potential to yield transformative advances in optimization, logistics, drug discovery, materials science, and artificial intelligence. By establishing the collaborative foundation now, this mobility project positions both groups to contribute meaningfully to these advances as quantum technologies mature.</w:t>
+        <w:t>Any commercially relevant outcomes will be jointly owned by both institutions according to their respective contributions, with revenue sharing agreements following each institution's IP policies. The base algorithms will remain open-source (GPL v3), while application-specific implementations may be licensed commercially through spin-off activities or industry partnerships. A Memorandum of Understanding defining IP arrangements will be signed at project initiation.</w:t>
       </w:r>
     </w:p>
     <w:p>
@@ -829,50 +1935,47 @@
         <w:pStyle w:val="Heading2"/>
       </w:pPr>
       <w:r>
-        <w:t>6.4 Sustainability</w:t>
+        <w:t>9.5 Capacity Building and Strategic Outcomes</w:t>
       </w:r>
     </w:p>
     <w:p>
+      <w:pPr>
+        <w:pStyle w:val="ListBullet"/>
+      </w:pPr>
       <w:r>
-        <w:t>The partnership established through this mobility grant is designed to be self-sustaining beyond the funding period. The joint grant proposals developed during the project, combined with the personal relationships and shared infrastructure built during the collaboration, will ensure continuity and growth of the research partnership.</w:t>
+        <w:t>At least 4 researchers trained in interdisciplinary quantum-evolutionary methods.</w:t>
       </w:r>
     </w:p>
     <w:p>
       <w:pPr>
-        <w:pStyle w:val="Heading1"/>
+        <w:pStyle w:val="ListBullet"/>
       </w:pPr>
       <w:r>
-        <w:t>References</w:t>
+        <w:t>Joint educational materials and training modules.</w:t>
       </w:r>
     </w:p>
     <w:p>
+      <w:pPr>
+        <w:pStyle w:val="ListBullet"/>
+      </w:pPr>
       <w:r>
-        <w:t>[1] Nielsen, M.A., &amp; Chuang, I.L. (2010). Quantum Computation and Quantum Information. Cambridge University Press.</w:t>
+        <w:t>Formal institutional collaboration agreement.</w:t>
       </w:r>
     </w:p>
     <w:p>
+      <w:pPr>
+        <w:pStyle w:val="ListBullet"/>
+      </w:pPr>
       <w:r>
-        <w:t>[2] Eiben, A.E., &amp; Smith, J.E. (2015). Introduction to Evolutionary Computing. Springer.</w:t>
+        <w:t>At least 2 follow-up funding applications (EU Horizon Europe, DST-FWF bilateral, SERB).</w:t>
       </w:r>
     </w:p>
     <w:p>
+      <w:pPr>
+        <w:pStyle w:val="ListBullet"/>
+      </w:pPr>
       <w:r>
-        <w:t>[3] Zhang, G. (2011). Quantum-inspired evolutionary algorithms: a survey and empirical study. Journal of Heuristics, 17(3), 303–351.</w:t>
-      </w:r>
-    </w:p>
-    <w:p>
-      <w:r>
-        <w:t>[4] Preskill, J. (2018). Quantum Computing in the NISQ era and beyond. Quantum, 2, 79.</w:t>
-      </w:r>
-    </w:p>
-    <w:p>
-      <w:r>
-        <w:t>[5] Cerezo, M., et al. (2021). Variational quantum algorithms. Nature Reviews Physics, 3(9), 625–644.</w:t>
-      </w:r>
-    </w:p>
-    <w:p>
-      <w:r>
-        <w:t>[6] Lu, Z., et al. (2022). Quantum-inspired evolutionary algorithms for optimization: a survey. Soft Computing, 26, 9467–9490.</w:t>
+        <w:t>Contributions to national quantum technology strategies (India's National Quantum Mission, Austria's Quantum Austria initiative).</w:t>
       </w:r>
     </w:p>
     <w:p/>
@@ -884,7 +1987,7 @@
         <w:rPr>
           <w:i/>
         </w:rPr>
-        <w:t>This research proposal has been prepared for submission as a mobility grant application to initiate collaborative research between partner institutions specializing in Quantum Computation and Evolutionary Algorithms.</w:t>
+        <w:t>Prepared for submission under the India-Austria Bilateral Scientific and Technological Cooperation Programme.</w:t>
       </w:r>
     </w:p>
     <w:sectPr>

</xml_diff>